<commit_message>
add new docx border function support and update test case example and template
</commit_message>
<xml_diff>
--- a/cloudofficeprint/src/main/resources/BeginnerGuide/UsingElements/template.docx
+++ b/cloudofficeprint/src/main/resources/BeginnerGuide/UsingElements/template.docx
@@ -1,6 +1,6 @@
 
 <file path=word/document.xml><?xml version="1.0" encoding="utf-8"?>
-<w:document xmlns:wpc="http://schemas.microsoft.com/office/word/2010/wordprocessingCanvas" xmlns:cx="http://schemas.microsoft.com/office/drawing/2014/chartex" xmlns:cx1="http://schemas.microsoft.com/office/drawing/2015/9/8/chartex" xmlns:cx2="http://schemas.microsoft.com/office/drawing/2015/10/21/chartex" xmlns:cx3="http://schemas.microsoft.com/office/drawing/2016/5/9/chartex" xmlns:cx4="http://schemas.microsoft.com/office/drawing/2016/5/10/chartex" xmlns:cx5="http://schemas.microsoft.com/office/drawing/2016/5/11/chartex" xmlns:cx6="http://schemas.microsoft.com/office/drawing/2016/5/12/chartex" xmlns:cx7="http://schemas.microsoft.com/office/drawing/2016/5/13/chartex" xmlns:cx8="http://schemas.microsoft.com/office/drawing/2016/5/14/chartex" xmlns:mc="http://schemas.openxmlformats.org/markup-compatibility/2006" xmlns:aink="http://schemas.microsoft.com/office/drawing/2016/ink" xmlns:am3d="http://schemas.microsoft.com/office/drawing/2017/model3d" xmlns:o="urn:schemas-microsoft-com:office:office" xmlns:r="http://schemas.openxmlformats.org/officeDocument/2006/relationships" xmlns:m="http://schemas.openxmlformats.org/officeDocument/2006/math" xmlns:v="urn:schemas-microsoft-com:vml" xmlns:wp14="http://schemas.microsoft.com/office/word/2010/wordprocessingDrawing" xmlns:wp="http://schemas.openxmlformats.org/drawingml/2006/wordprocessingDrawing" xmlns:w10="urn:schemas-microsoft-com:office:word" xmlns:w="http://schemas.openxmlformats.org/wordprocessingml/2006/main" xmlns:w14="http://schemas.microsoft.com/office/word/2010/wordml" xmlns:w15="http://schemas.microsoft.com/office/word/2012/wordml" xmlns:w16cex="http://schemas.microsoft.com/office/word/2018/wordml/cex" xmlns:w16cid="http://schemas.microsoft.com/office/word/2016/wordml/cid" xmlns:w16="http://schemas.microsoft.com/office/word/2018/wordml" xmlns:w16sdtdh="http://schemas.microsoft.com/office/word/2020/wordml/sdtdatahash" xmlns:w16se="http://schemas.microsoft.com/office/word/2015/wordml/symex" xmlns:wpg="http://schemas.microsoft.com/office/word/2010/wordprocessingGroup" xmlns:wpi="http://schemas.microsoft.com/office/word/2010/wordprocessingInk" xmlns:wne="http://schemas.microsoft.com/office/word/2006/wordml" xmlns:wps="http://schemas.microsoft.com/office/word/2010/wordprocessingShape" mc:Ignorable="w14 w15 w16se w16cid w16 w16cex w16sdtdh wp14">
+<w:document xmlns:wpc="http://schemas.microsoft.com/office/word/2010/wordprocessingCanvas" xmlns:cx="http://schemas.microsoft.com/office/drawing/2014/chartex" xmlns:cx1="http://schemas.microsoft.com/office/drawing/2015/9/8/chartex" xmlns:cx2="http://schemas.microsoft.com/office/drawing/2015/10/21/chartex" xmlns:cx3="http://schemas.microsoft.com/office/drawing/2016/5/9/chartex" xmlns:cx4="http://schemas.microsoft.com/office/drawing/2016/5/10/chartex" xmlns:cx5="http://schemas.microsoft.com/office/drawing/2016/5/11/chartex" xmlns:cx6="http://schemas.microsoft.com/office/drawing/2016/5/12/chartex" xmlns:cx7="http://schemas.microsoft.com/office/drawing/2016/5/13/chartex" xmlns:cx8="http://schemas.microsoft.com/office/drawing/2016/5/14/chartex" xmlns:mc="http://schemas.openxmlformats.org/markup-compatibility/2006" xmlns:aink="http://schemas.microsoft.com/office/drawing/2016/ink" xmlns:am3d="http://schemas.microsoft.com/office/drawing/2017/model3d" xmlns:o="urn:schemas-microsoft-com:office:office" xmlns:oel="http://schemas.microsoft.com/office/2019/extlst" xmlns:r="http://schemas.openxmlformats.org/officeDocument/2006/relationships" xmlns:m="http://schemas.openxmlformats.org/officeDocument/2006/math" xmlns:v="urn:schemas-microsoft-com:vml" xmlns:wp14="http://schemas.microsoft.com/office/word/2010/wordprocessingDrawing" xmlns:wp="http://schemas.openxmlformats.org/drawingml/2006/wordprocessingDrawing" xmlns:w10="urn:schemas-microsoft-com:office:word" xmlns:w="http://schemas.openxmlformats.org/wordprocessingml/2006/main" xmlns:w14="http://schemas.microsoft.com/office/word/2010/wordml" xmlns:w15="http://schemas.microsoft.com/office/word/2012/wordml" xmlns:w16cex="http://schemas.microsoft.com/office/word/2018/wordml/cex" xmlns:w16cid="http://schemas.microsoft.com/office/word/2016/wordml/cid" xmlns:w16="http://schemas.microsoft.com/office/word/2018/wordml" xmlns:w16du="http://schemas.microsoft.com/office/word/2023/wordml/word16du" xmlns:w16sdtdh="http://schemas.microsoft.com/office/word/2020/wordml/sdtdatahash" xmlns:w16se="http://schemas.microsoft.com/office/word/2015/wordml/symex" xmlns:wpg="http://schemas.microsoft.com/office/word/2010/wordprocessingGroup" xmlns:wpi="http://schemas.microsoft.com/office/word/2010/wordprocessingInk" xmlns:wne="http://schemas.microsoft.com/office/word/2006/wordml" xmlns:wps="http://schemas.microsoft.com/office/word/2010/wordprocessingShape" mc:Ignorable="w14 w15 w16se w16cid w16 w16cex w16sdtdh w16du wp14">
   <w:body>
     <w:p>
       <w:r>
@@ -8,7 +8,7 @@
           <w:noProof/>
         </w:rPr>
         <w:drawing>
-          <wp:inline distT="0" distB="0" distL="0" distR="0">
+          <wp:inline distT="0" distB="0" distL="0" distR="0" wp14:anchorId="678FD4C5" wp14:editId="13E26E7F">
             <wp:extent cx="4189268" cy="781050"/>
             <wp:effectExtent l="0" t="0" r="0" b="0"/>
             <wp:docPr id="2" name="Picture 2"/>
@@ -135,6 +135,7 @@
         </w:rPr>
         <w:t>{</w:t>
       </w:r>
+      <w:proofErr w:type="spellStart"/>
       <w:r>
         <w:rPr>
           <w:sz w:val="24"/>
@@ -142,6 +143,7 @@
         </w:rPr>
         <w:t>cellStyle</w:t>
       </w:r>
+      <w:proofErr w:type="spellEnd"/>
       <w:r>
         <w:rPr>
           <w:sz w:val="24"/>
@@ -185,24 +187,41 @@
           <w:sz w:val="24"/>
           <w:szCs w:val="22"/>
         </w:rPr>
-        <w:t>{*auto autoLink}</w:t>
-      </w:r>
-    </w:p>
-    <w:p>
-      <w:pPr>
-        <w:rPr>
-          <w:sz w:val="24"/>
-          <w:szCs w:val="22"/>
-        </w:rPr>
-      </w:pPr>
-    </w:p>
-    <w:p>
-      <w:pPr>
-        <w:rPr>
-          <w:sz w:val="24"/>
-          <w:szCs w:val="22"/>
-        </w:rPr>
-      </w:pPr>
+        <w:t xml:space="preserve">{*auto </w:t>
+      </w:r>
+      <w:proofErr w:type="spellStart"/>
+      <w:r>
+        <w:rPr>
+          <w:sz w:val="24"/>
+          <w:szCs w:val="22"/>
+        </w:rPr>
+        <w:t>autoLink</w:t>
+      </w:r>
+      <w:proofErr w:type="spellEnd"/>
+      <w:r>
+        <w:rPr>
+          <w:sz w:val="24"/>
+          <w:szCs w:val="22"/>
+        </w:rPr>
+        <w:t>}</w:t>
+      </w:r>
+    </w:p>
+    <w:p>
+      <w:pPr>
+        <w:rPr>
+          <w:sz w:val="24"/>
+          <w:szCs w:val="22"/>
+        </w:rPr>
+      </w:pPr>
+    </w:p>
+    <w:p>
+      <w:pPr>
+        <w:rPr>
+          <w:sz w:val="24"/>
+          <w:szCs w:val="22"/>
+        </w:rPr>
+      </w:pPr>
+      <w:proofErr w:type="spellStart"/>
       <w:r>
         <w:rPr>
           <w:sz w:val="24"/>
@@ -210,6 +229,7 @@
         </w:rPr>
         <w:t>HyperLink</w:t>
       </w:r>
+      <w:proofErr w:type="spellEnd"/>
     </w:p>
     <w:p>
       <w:pPr>
@@ -225,6 +245,7 @@
         </w:rPr>
         <w:t>{*</w:t>
       </w:r>
+      <w:proofErr w:type="spellStart"/>
       <w:r>
         <w:rPr>
           <w:sz w:val="24"/>
@@ -232,6 +253,7 @@
         </w:rPr>
         <w:t>COP_link</w:t>
       </w:r>
+      <w:proofErr w:type="spellEnd"/>
       <w:r>
         <w:rPr>
           <w:sz w:val="24"/>
@@ -277,6 +299,7 @@
         </w:rPr>
         <w:t xml:space="preserve">{style </w:t>
       </w:r>
+      <w:proofErr w:type="spellStart"/>
       <w:r>
         <w:rPr>
           <w:sz w:val="24"/>
@@ -284,6 +307,7 @@
         </w:rPr>
         <w:t>styled_property</w:t>
       </w:r>
+      <w:proofErr w:type="spellEnd"/>
       <w:r>
         <w:rPr>
           <w:sz w:val="24"/>
@@ -314,10 +338,104 @@
       </w:r>
     </w:p>
     <w:p>
-      <w:r>
-        <w:t>{?insert doc}</w:t>
-      </w:r>
-    </w:p>
+      <w:proofErr w:type="gramStart"/>
+      <w:r>
+        <w:t>{?insert</w:t>
+      </w:r>
+      <w:proofErr w:type="gramEnd"/>
+      <w:r>
+        <w:t xml:space="preserve"> doc}</w:t>
+      </w:r>
+    </w:p>
+    <w:p>
+      <w:pPr>
+        <w:jc w:val="center"/>
+      </w:pPr>
+    </w:p>
+    <w:p>
+      <w:pPr>
+        <w:jc w:val="center"/>
+        <w:rPr>
+          <w:b/>
+          <w:bCs/>
+          <w:sz w:val="32"/>
+          <w:szCs w:val="32"/>
+        </w:rPr>
+      </w:pPr>
+    </w:p>
+    <w:p>
+      <w:pPr>
+        <w:jc w:val="center"/>
+        <w:rPr>
+          <w:b/>
+          <w:bCs/>
+          <w:sz w:val="32"/>
+          <w:szCs w:val="32"/>
+        </w:rPr>
+      </w:pPr>
+    </w:p>
+    <w:p>
+      <w:pPr>
+        <w:jc w:val="center"/>
+        <w:rPr>
+          <w:b/>
+          <w:bCs/>
+          <w:sz w:val="32"/>
+          <w:szCs w:val="32"/>
+        </w:rPr>
+      </w:pPr>
+    </w:p>
+    <w:p>
+      <w:pPr>
+        <w:jc w:val="center"/>
+        <w:rPr>
+          <w:b/>
+          <w:bCs/>
+          <w:sz w:val="32"/>
+          <w:szCs w:val="32"/>
+        </w:rPr>
+      </w:pPr>
+      <w:r>
+        <w:rPr>
+          <w:b/>
+          <w:bCs/>
+          <w:sz w:val="32"/>
+          <w:szCs w:val="32"/>
+        </w:rPr>
+        <w:lastRenderedPageBreak/>
+        <w:t>Border and Cell Styles</w:t>
+      </w:r>
+    </w:p>
+    <w:tbl>
+      <w:tblPr>
+        <w:tblStyle w:val="TableGrid"/>
+        <w:tblW w:w="0" w:type="auto"/>
+        <w:tblLook w:val="04A0" w:firstRow="1" w:lastRow="0" w:firstColumn="1" w:lastColumn="0" w:noHBand="0" w:noVBand="1"/>
+      </w:tblPr>
+      <w:tblGrid>
+        <w:gridCol w:w="9350"/>
+      </w:tblGrid>
+      <w:tr>
+        <w:tc>
+          <w:tcPr>
+            <w:tcW w:w="9350" w:type="dxa"/>
+          </w:tcPr>
+          <w:p>
+            <w:r>
+              <w:t>{</w:t>
+            </w:r>
+            <w:proofErr w:type="spellStart"/>
+            <w:r>
+              <w:t>cellStyle</w:t>
+            </w:r>
+            <w:proofErr w:type="spellEnd"/>
+            <w:r>
+              <w:t>$}</w:t>
+            </w:r>
+          </w:p>
+        </w:tc>
+      </w:tr>
+    </w:tbl>
     <w:p>
       <w:pPr>
         <w:jc w:val="center"/>
@@ -335,7 +453,7 @@
 </file>
 
 <file path=word/endnotes.xml><?xml version="1.0" encoding="utf-8"?>
-<w:endnotes xmlns:wpc="http://schemas.microsoft.com/office/word/2010/wordprocessingCanvas" xmlns:cx="http://schemas.microsoft.com/office/drawing/2014/chartex" xmlns:cx1="http://schemas.microsoft.com/office/drawing/2015/9/8/chartex" xmlns:cx2="http://schemas.microsoft.com/office/drawing/2015/10/21/chartex" xmlns:cx3="http://schemas.microsoft.com/office/drawing/2016/5/9/chartex" xmlns:cx4="http://schemas.microsoft.com/office/drawing/2016/5/10/chartex" xmlns:cx5="http://schemas.microsoft.com/office/drawing/2016/5/11/chartex" xmlns:cx6="http://schemas.microsoft.com/office/drawing/2016/5/12/chartex" xmlns:cx7="http://schemas.microsoft.com/office/drawing/2016/5/13/chartex" xmlns:cx8="http://schemas.microsoft.com/office/drawing/2016/5/14/chartex" xmlns:mc="http://schemas.openxmlformats.org/markup-compatibility/2006" xmlns:aink="http://schemas.microsoft.com/office/drawing/2016/ink" xmlns:am3d="http://schemas.microsoft.com/office/drawing/2017/model3d" xmlns:o="urn:schemas-microsoft-com:office:office" xmlns:r="http://schemas.openxmlformats.org/officeDocument/2006/relationships" xmlns:m="http://schemas.openxmlformats.org/officeDocument/2006/math" xmlns:v="urn:schemas-microsoft-com:vml" xmlns:wp14="http://schemas.microsoft.com/office/word/2010/wordprocessingDrawing" xmlns:wp="http://schemas.openxmlformats.org/drawingml/2006/wordprocessingDrawing" xmlns:w10="urn:schemas-microsoft-com:office:word" xmlns:w="http://schemas.openxmlformats.org/wordprocessingml/2006/main" xmlns:w14="http://schemas.microsoft.com/office/word/2010/wordml" xmlns:w15="http://schemas.microsoft.com/office/word/2012/wordml" xmlns:w16cex="http://schemas.microsoft.com/office/word/2018/wordml/cex" xmlns:w16cid="http://schemas.microsoft.com/office/word/2016/wordml/cid" xmlns:w16="http://schemas.microsoft.com/office/word/2018/wordml" xmlns:w16sdtdh="http://schemas.microsoft.com/office/word/2020/wordml/sdtdatahash" xmlns:w16se="http://schemas.microsoft.com/office/word/2015/wordml/symex" xmlns:wpg="http://schemas.microsoft.com/office/word/2010/wordprocessingGroup" xmlns:wpi="http://schemas.microsoft.com/office/word/2010/wordprocessingInk" xmlns:wne="http://schemas.microsoft.com/office/word/2006/wordml" xmlns:wps="http://schemas.microsoft.com/office/word/2010/wordprocessingShape" mc:Ignorable="w14 w15 w16se w16cid w16 w16cex w16sdtdh wp14">
+<w:endnotes xmlns:wpc="http://schemas.microsoft.com/office/word/2010/wordprocessingCanvas" xmlns:cx="http://schemas.microsoft.com/office/drawing/2014/chartex" xmlns:cx1="http://schemas.microsoft.com/office/drawing/2015/9/8/chartex" xmlns:cx2="http://schemas.microsoft.com/office/drawing/2015/10/21/chartex" xmlns:cx3="http://schemas.microsoft.com/office/drawing/2016/5/9/chartex" xmlns:cx4="http://schemas.microsoft.com/office/drawing/2016/5/10/chartex" xmlns:cx5="http://schemas.microsoft.com/office/drawing/2016/5/11/chartex" xmlns:cx6="http://schemas.microsoft.com/office/drawing/2016/5/12/chartex" xmlns:cx7="http://schemas.microsoft.com/office/drawing/2016/5/13/chartex" xmlns:cx8="http://schemas.microsoft.com/office/drawing/2016/5/14/chartex" xmlns:mc="http://schemas.openxmlformats.org/markup-compatibility/2006" xmlns:aink="http://schemas.microsoft.com/office/drawing/2016/ink" xmlns:am3d="http://schemas.microsoft.com/office/drawing/2017/model3d" xmlns:o="urn:schemas-microsoft-com:office:office" xmlns:oel="http://schemas.microsoft.com/office/2019/extlst" xmlns:r="http://schemas.openxmlformats.org/officeDocument/2006/relationships" xmlns:m="http://schemas.openxmlformats.org/officeDocument/2006/math" xmlns:v="urn:schemas-microsoft-com:vml" xmlns:wp14="http://schemas.microsoft.com/office/word/2010/wordprocessingDrawing" xmlns:wp="http://schemas.openxmlformats.org/drawingml/2006/wordprocessingDrawing" xmlns:w10="urn:schemas-microsoft-com:office:word" xmlns:w="http://schemas.openxmlformats.org/wordprocessingml/2006/main" xmlns:w14="http://schemas.microsoft.com/office/word/2010/wordml" xmlns:w15="http://schemas.microsoft.com/office/word/2012/wordml" xmlns:w16cex="http://schemas.microsoft.com/office/word/2018/wordml/cex" xmlns:w16cid="http://schemas.microsoft.com/office/word/2016/wordml/cid" xmlns:w16="http://schemas.microsoft.com/office/word/2018/wordml" xmlns:w16du="http://schemas.microsoft.com/office/word/2023/wordml/word16du" xmlns:w16sdtdh="http://schemas.microsoft.com/office/word/2020/wordml/sdtdatahash" xmlns:w16se="http://schemas.microsoft.com/office/word/2015/wordml/symex" xmlns:wpg="http://schemas.microsoft.com/office/word/2010/wordprocessingGroup" xmlns:wpi="http://schemas.microsoft.com/office/word/2010/wordprocessingInk" xmlns:wne="http://schemas.microsoft.com/office/word/2006/wordml" xmlns:wps="http://schemas.microsoft.com/office/word/2010/wordprocessingShape" mc:Ignorable="w14 w15 w16se w16cid w16 w16cex w16sdtdh w16du wp14">
   <w:endnote w:type="separator" w:id="-1">
     <w:p>
       <w:pPr>
@@ -360,7 +478,7 @@
 </file>
 
 <file path=word/footnotes.xml><?xml version="1.0" encoding="utf-8"?>
-<w:footnotes xmlns:wpc="http://schemas.microsoft.com/office/word/2010/wordprocessingCanvas" xmlns:cx="http://schemas.microsoft.com/office/drawing/2014/chartex" xmlns:cx1="http://schemas.microsoft.com/office/drawing/2015/9/8/chartex" xmlns:cx2="http://schemas.microsoft.com/office/drawing/2015/10/21/chartex" xmlns:cx3="http://schemas.microsoft.com/office/drawing/2016/5/9/chartex" xmlns:cx4="http://schemas.microsoft.com/office/drawing/2016/5/10/chartex" xmlns:cx5="http://schemas.microsoft.com/office/drawing/2016/5/11/chartex" xmlns:cx6="http://schemas.microsoft.com/office/drawing/2016/5/12/chartex" xmlns:cx7="http://schemas.microsoft.com/office/drawing/2016/5/13/chartex" xmlns:cx8="http://schemas.microsoft.com/office/drawing/2016/5/14/chartex" xmlns:mc="http://schemas.openxmlformats.org/markup-compatibility/2006" xmlns:aink="http://schemas.microsoft.com/office/drawing/2016/ink" xmlns:am3d="http://schemas.microsoft.com/office/drawing/2017/model3d" xmlns:o="urn:schemas-microsoft-com:office:office" xmlns:r="http://schemas.openxmlformats.org/officeDocument/2006/relationships" xmlns:m="http://schemas.openxmlformats.org/officeDocument/2006/math" xmlns:v="urn:schemas-microsoft-com:vml" xmlns:wp14="http://schemas.microsoft.com/office/word/2010/wordprocessingDrawing" xmlns:wp="http://schemas.openxmlformats.org/drawingml/2006/wordprocessingDrawing" xmlns:w10="urn:schemas-microsoft-com:office:word" xmlns:w="http://schemas.openxmlformats.org/wordprocessingml/2006/main" xmlns:w14="http://schemas.microsoft.com/office/word/2010/wordml" xmlns:w15="http://schemas.microsoft.com/office/word/2012/wordml" xmlns:w16cex="http://schemas.microsoft.com/office/word/2018/wordml/cex" xmlns:w16cid="http://schemas.microsoft.com/office/word/2016/wordml/cid" xmlns:w16="http://schemas.microsoft.com/office/word/2018/wordml" xmlns:w16sdtdh="http://schemas.microsoft.com/office/word/2020/wordml/sdtdatahash" xmlns:w16se="http://schemas.microsoft.com/office/word/2015/wordml/symex" xmlns:wpg="http://schemas.microsoft.com/office/word/2010/wordprocessingGroup" xmlns:wpi="http://schemas.microsoft.com/office/word/2010/wordprocessingInk" xmlns:wne="http://schemas.microsoft.com/office/word/2006/wordml" xmlns:wps="http://schemas.microsoft.com/office/word/2010/wordprocessingShape" mc:Ignorable="w14 w15 w16se w16cid w16 w16cex w16sdtdh wp14">
+<w:footnotes xmlns:wpc="http://schemas.microsoft.com/office/word/2010/wordprocessingCanvas" xmlns:cx="http://schemas.microsoft.com/office/drawing/2014/chartex" xmlns:cx1="http://schemas.microsoft.com/office/drawing/2015/9/8/chartex" xmlns:cx2="http://schemas.microsoft.com/office/drawing/2015/10/21/chartex" xmlns:cx3="http://schemas.microsoft.com/office/drawing/2016/5/9/chartex" xmlns:cx4="http://schemas.microsoft.com/office/drawing/2016/5/10/chartex" xmlns:cx5="http://schemas.microsoft.com/office/drawing/2016/5/11/chartex" xmlns:cx6="http://schemas.microsoft.com/office/drawing/2016/5/12/chartex" xmlns:cx7="http://schemas.microsoft.com/office/drawing/2016/5/13/chartex" xmlns:cx8="http://schemas.microsoft.com/office/drawing/2016/5/14/chartex" xmlns:mc="http://schemas.openxmlformats.org/markup-compatibility/2006" xmlns:aink="http://schemas.microsoft.com/office/drawing/2016/ink" xmlns:am3d="http://schemas.microsoft.com/office/drawing/2017/model3d" xmlns:o="urn:schemas-microsoft-com:office:office" xmlns:oel="http://schemas.microsoft.com/office/2019/extlst" xmlns:r="http://schemas.openxmlformats.org/officeDocument/2006/relationships" xmlns:m="http://schemas.openxmlformats.org/officeDocument/2006/math" xmlns:v="urn:schemas-microsoft-com:vml" xmlns:wp14="http://schemas.microsoft.com/office/word/2010/wordprocessingDrawing" xmlns:wp="http://schemas.openxmlformats.org/drawingml/2006/wordprocessingDrawing" xmlns:w10="urn:schemas-microsoft-com:office:word" xmlns:w="http://schemas.openxmlformats.org/wordprocessingml/2006/main" xmlns:w14="http://schemas.microsoft.com/office/word/2010/wordml" xmlns:w15="http://schemas.microsoft.com/office/word/2012/wordml" xmlns:w16cex="http://schemas.microsoft.com/office/word/2018/wordml/cex" xmlns:w16cid="http://schemas.microsoft.com/office/word/2016/wordml/cid" xmlns:w16="http://schemas.microsoft.com/office/word/2018/wordml" xmlns:w16du="http://schemas.microsoft.com/office/word/2023/wordml/word16du" xmlns:w16sdtdh="http://schemas.microsoft.com/office/word/2020/wordml/sdtdatahash" xmlns:w16se="http://schemas.microsoft.com/office/word/2015/wordml/symex" xmlns:wpg="http://schemas.microsoft.com/office/word/2010/wordprocessingGroup" xmlns:wpi="http://schemas.microsoft.com/office/word/2010/wordprocessingInk" xmlns:wne="http://schemas.microsoft.com/office/word/2006/wordml" xmlns:wps="http://schemas.microsoft.com/office/word/2010/wordprocessingShape" mc:Ignorable="w14 w15 w16se w16cid w16 w16cex w16sdtdh w16du wp14">
   <w:footnote w:type="separator" w:id="-1">
     <w:p>
       <w:pPr>
@@ -385,13 +503,29 @@
 </file>
 
 <file path=word/header1.xml><?xml version="1.0" encoding="utf-8"?>
-<w:hdr xmlns:wpc="http://schemas.microsoft.com/office/word/2010/wordprocessingCanvas" xmlns:cx="http://schemas.microsoft.com/office/drawing/2014/chartex" xmlns:cx1="http://schemas.microsoft.com/office/drawing/2015/9/8/chartex" xmlns:cx2="http://schemas.microsoft.com/office/drawing/2015/10/21/chartex" xmlns:cx3="http://schemas.microsoft.com/office/drawing/2016/5/9/chartex" xmlns:cx4="http://schemas.microsoft.com/office/drawing/2016/5/10/chartex" xmlns:cx5="http://schemas.microsoft.com/office/drawing/2016/5/11/chartex" xmlns:cx6="http://schemas.microsoft.com/office/drawing/2016/5/12/chartex" xmlns:cx7="http://schemas.microsoft.com/office/drawing/2016/5/13/chartex" xmlns:cx8="http://schemas.microsoft.com/office/drawing/2016/5/14/chartex" xmlns:mc="http://schemas.openxmlformats.org/markup-compatibility/2006" xmlns:aink="http://schemas.microsoft.com/office/drawing/2016/ink" xmlns:am3d="http://schemas.microsoft.com/office/drawing/2017/model3d" xmlns:o="urn:schemas-microsoft-com:office:office" xmlns:r="http://schemas.openxmlformats.org/officeDocument/2006/relationships" xmlns:m="http://schemas.openxmlformats.org/officeDocument/2006/math" xmlns:v="urn:schemas-microsoft-com:vml" xmlns:wp14="http://schemas.microsoft.com/office/word/2010/wordprocessingDrawing" xmlns:wp="http://schemas.openxmlformats.org/drawingml/2006/wordprocessingDrawing" xmlns:w10="urn:schemas-microsoft-com:office:word" xmlns:w="http://schemas.openxmlformats.org/wordprocessingml/2006/main" xmlns:w14="http://schemas.microsoft.com/office/word/2010/wordml" xmlns:w15="http://schemas.microsoft.com/office/word/2012/wordml" xmlns:w16cex="http://schemas.microsoft.com/office/word/2018/wordml/cex" xmlns:w16cid="http://schemas.microsoft.com/office/word/2016/wordml/cid" xmlns:w16="http://schemas.microsoft.com/office/word/2018/wordml" xmlns:w16sdtdh="http://schemas.microsoft.com/office/word/2020/wordml/sdtdatahash" xmlns:w16se="http://schemas.microsoft.com/office/word/2015/wordml/symex" xmlns:wpg="http://schemas.microsoft.com/office/word/2010/wordprocessingGroup" xmlns:wpi="http://schemas.microsoft.com/office/word/2010/wordprocessingInk" xmlns:wne="http://schemas.microsoft.com/office/word/2006/wordml" xmlns:wps="http://schemas.microsoft.com/office/word/2010/wordprocessingShape" mc:Ignorable="w14 w15 w16se w16cid w16 w16cex w16sdtdh wp14">
+<w:hdr xmlns:wpc="http://schemas.microsoft.com/office/word/2010/wordprocessingCanvas" xmlns:cx="http://schemas.microsoft.com/office/drawing/2014/chartex" xmlns:cx1="http://schemas.microsoft.com/office/drawing/2015/9/8/chartex" xmlns:cx2="http://schemas.microsoft.com/office/drawing/2015/10/21/chartex" xmlns:cx3="http://schemas.microsoft.com/office/drawing/2016/5/9/chartex" xmlns:cx4="http://schemas.microsoft.com/office/drawing/2016/5/10/chartex" xmlns:cx5="http://schemas.microsoft.com/office/drawing/2016/5/11/chartex" xmlns:cx6="http://schemas.microsoft.com/office/drawing/2016/5/12/chartex" xmlns:cx7="http://schemas.microsoft.com/office/drawing/2016/5/13/chartex" xmlns:cx8="http://schemas.microsoft.com/office/drawing/2016/5/14/chartex" xmlns:mc="http://schemas.openxmlformats.org/markup-compatibility/2006" xmlns:aink="http://schemas.microsoft.com/office/drawing/2016/ink" xmlns:am3d="http://schemas.microsoft.com/office/drawing/2017/model3d" xmlns:o="urn:schemas-microsoft-com:office:office" xmlns:oel="http://schemas.microsoft.com/office/2019/extlst" xmlns:r="http://schemas.openxmlformats.org/officeDocument/2006/relationships" xmlns:m="http://schemas.openxmlformats.org/officeDocument/2006/math" xmlns:v="urn:schemas-microsoft-com:vml" xmlns:wp14="http://schemas.microsoft.com/office/word/2010/wordprocessingDrawing" xmlns:wp="http://schemas.openxmlformats.org/drawingml/2006/wordprocessingDrawing" xmlns:w10="urn:schemas-microsoft-com:office:word" xmlns:w="http://schemas.openxmlformats.org/wordprocessingml/2006/main" xmlns:w14="http://schemas.microsoft.com/office/word/2010/wordml" xmlns:w15="http://schemas.microsoft.com/office/word/2012/wordml" xmlns:w16cex="http://schemas.microsoft.com/office/word/2018/wordml/cex" xmlns:w16cid="http://schemas.microsoft.com/office/word/2016/wordml/cid" xmlns:w16="http://schemas.microsoft.com/office/word/2018/wordml" xmlns:w16du="http://schemas.microsoft.com/office/word/2023/wordml/word16du" xmlns:w16sdtdh="http://schemas.microsoft.com/office/word/2020/wordml/sdtdatahash" xmlns:w16se="http://schemas.microsoft.com/office/word/2015/wordml/symex" xmlns:wpg="http://schemas.microsoft.com/office/word/2010/wordprocessingGroup" xmlns:wpi="http://schemas.microsoft.com/office/word/2010/wordprocessingInk" xmlns:wne="http://schemas.microsoft.com/office/word/2006/wordml" xmlns:wps="http://schemas.microsoft.com/office/word/2010/wordprocessingShape" mc:Ignorable="w14 w15 w16se w16cid w16 w16cex w16sdtdh w16du wp14">
   <w:p>
     <w:pPr>
       <w:pStyle w:val="Header"/>
     </w:pPr>
     <w:r>
-      <w:t>{watemark wm_name}</w:t>
+      <w:t>{</w:t>
+    </w:r>
+    <w:proofErr w:type="spellStart"/>
+    <w:r>
+      <w:t>watemark</w:t>
+    </w:r>
+    <w:proofErr w:type="spellEnd"/>
+    <w:r>
+      <w:t xml:space="preserve"> </w:t>
+    </w:r>
+    <w:proofErr w:type="spellStart"/>
+    <w:r>
+      <w:t>wm_name</w:t>
+    </w:r>
+    <w:proofErr w:type="spellEnd"/>
+    <w:r>
+      <w:t>}</w:t>
     </w:r>
   </w:p>
   <w:p>
@@ -403,7 +537,7 @@
 </file>
 
 <file path=word/styles.xml><?xml version="1.0" encoding="utf-8"?>
-<w:styles xmlns:mc="http://schemas.openxmlformats.org/markup-compatibility/2006" xmlns:r="http://schemas.openxmlformats.org/officeDocument/2006/relationships" xmlns:w="http://schemas.openxmlformats.org/wordprocessingml/2006/main" xmlns:w14="http://schemas.microsoft.com/office/word/2010/wordml" xmlns:w15="http://schemas.microsoft.com/office/word/2012/wordml" xmlns:w16cex="http://schemas.microsoft.com/office/word/2018/wordml/cex" xmlns:w16cid="http://schemas.microsoft.com/office/word/2016/wordml/cid" xmlns:w16="http://schemas.microsoft.com/office/word/2018/wordml" xmlns:w16sdtdh="http://schemas.microsoft.com/office/word/2020/wordml/sdtdatahash" xmlns:w16se="http://schemas.microsoft.com/office/word/2015/wordml/symex" mc:Ignorable="w14 w15 w16se w16cid w16 w16cex w16sdtdh">
+<w:styles xmlns:mc="http://schemas.openxmlformats.org/markup-compatibility/2006" xmlns:r="http://schemas.openxmlformats.org/officeDocument/2006/relationships" xmlns:w="http://schemas.openxmlformats.org/wordprocessingml/2006/main" xmlns:w14="http://schemas.microsoft.com/office/word/2010/wordml" xmlns:w15="http://schemas.microsoft.com/office/word/2012/wordml" xmlns:w16cex="http://schemas.microsoft.com/office/word/2018/wordml/cex" xmlns:w16cid="http://schemas.microsoft.com/office/word/2016/wordml/cid" xmlns:w16="http://schemas.microsoft.com/office/word/2018/wordml" xmlns:w16du="http://schemas.microsoft.com/office/word/2023/wordml/word16du" xmlns:w16sdtdh="http://schemas.microsoft.com/office/word/2020/wordml/sdtdatahash" xmlns:w16se="http://schemas.microsoft.com/office/word/2015/wordml/symex" mc:Ignorable="w14 w15 w16se w16cid w16 w16cex w16sdtdh w16du">
   <w:docDefaults>
     <w:rPrDefault>
       <w:rPr>
@@ -888,6 +1022,55 @@
     <w:link w:val="Footer"/>
     <w:uiPriority w:val="99"/>
   </w:style>
+  <w:style w:type="table" w:styleId="TableGrid">
+    <w:name w:val="Table Grid"/>
+    <w:basedOn w:val="TableNormal"/>
+    <w:uiPriority w:val="39"/>
+    <w:rsid w:val="00E660FB"/>
+    <w:pPr>
+      <w:spacing w:after="0" w:line="240" w:lineRule="auto"/>
+    </w:pPr>
+    <w:tblPr>
+      <w:tblBorders>
+        <w:top w:val="single" w:sz="4" w:space="0" w:color="auto"/>
+        <w:left w:val="single" w:sz="4" w:space="0" w:color="auto"/>
+        <w:bottom w:val="single" w:sz="4" w:space="0" w:color="auto"/>
+        <w:right w:val="single" w:sz="4" w:space="0" w:color="auto"/>
+        <w:insideH w:val="single" w:sz="4" w:space="0" w:color="auto"/>
+        <w:insideV w:val="single" w:sz="4" w:space="0" w:color="auto"/>
+      </w:tblBorders>
+    </w:tblPr>
+  </w:style>
+  <w:style w:type="paragraph" w:styleId="HTMLPreformatted">
+    <w:name w:val="HTML Preformatted"/>
+    <w:basedOn w:val="Normal"/>
+    <w:link w:val="HTMLPreformattedChar"/>
+    <w:uiPriority w:val="99"/>
+    <w:semiHidden/>
+    <w:unhideWhenUsed/>
+    <w:rsid w:val="003449AA"/>
+    <w:pPr>
+      <w:spacing w:after="0" w:line="240" w:lineRule="auto"/>
+    </w:pPr>
+    <w:rPr>
+      <w:rFonts w:ascii="Consolas" w:hAnsi="Consolas"/>
+      <w:sz w:val="20"/>
+      <w:szCs w:val="18"/>
+    </w:rPr>
+  </w:style>
+  <w:style w:type="character" w:customStyle="1" w:styleId="HTMLPreformattedChar">
+    <w:name w:val="HTML Preformatted Char"/>
+    <w:basedOn w:val="DefaultParagraphFont"/>
+    <w:link w:val="HTMLPreformatted"/>
+    <w:uiPriority w:val="99"/>
+    <w:semiHidden/>
+    <w:rsid w:val="003449AA"/>
+    <w:rPr>
+      <w:rFonts w:ascii="Consolas" w:hAnsi="Consolas"/>
+      <w:sz w:val="20"/>
+      <w:szCs w:val="18"/>
+    </w:rPr>
+  </w:style>
 </w:styles>
 </file>
 

</xml_diff>

<commit_message>
create new remove class to add {remove?} feature to remove the added shape completely when the tag has falsy values for pptx, fix error in the tempate of beginners guide, update RenderElementsTests and main class refactor
</commit_message>
<xml_diff>
--- a/cloudofficeprint/src/main/resources/BeginnerGuide/UsingElements/template.docx
+++ b/cloudofficeprint/src/main/resources/BeginnerGuide/UsingElements/template.docx
@@ -118,60 +118,6 @@
           <w:sz w:val="24"/>
           <w:szCs w:val="22"/>
         </w:rPr>
-        <w:t>Cell Style</w:t>
-      </w:r>
-    </w:p>
-    <w:p>
-      <w:pPr>
-        <w:rPr>
-          <w:sz w:val="24"/>
-          <w:szCs w:val="22"/>
-        </w:rPr>
-      </w:pPr>
-      <w:r>
-        <w:rPr>
-          <w:sz w:val="24"/>
-          <w:szCs w:val="22"/>
-        </w:rPr>
-        <w:t>{</w:t>
-      </w:r>
-      <w:proofErr w:type="spellStart"/>
-      <w:r>
-        <w:rPr>
-          <w:sz w:val="24"/>
-          <w:szCs w:val="22"/>
-        </w:rPr>
-        <w:t>cellStyle</w:t>
-      </w:r>
-      <w:proofErr w:type="spellEnd"/>
-      <w:r>
-        <w:rPr>
-          <w:sz w:val="24"/>
-          <w:szCs w:val="22"/>
-        </w:rPr>
-        <w:t>$}</w:t>
-      </w:r>
-    </w:p>
-    <w:p>
-      <w:pPr>
-        <w:rPr>
-          <w:sz w:val="24"/>
-          <w:szCs w:val="22"/>
-        </w:rPr>
-      </w:pPr>
-    </w:p>
-    <w:p>
-      <w:pPr>
-        <w:rPr>
-          <w:sz w:val="24"/>
-          <w:szCs w:val="22"/>
-        </w:rPr>
-      </w:pPr>
-      <w:r>
-        <w:rPr>
-          <w:sz w:val="24"/>
-          <w:szCs w:val="22"/>
-        </w:rPr>
         <w:t>Auto Link</w:t>
       </w:r>
     </w:p>
@@ -187,41 +133,24 @@
           <w:sz w:val="24"/>
           <w:szCs w:val="22"/>
         </w:rPr>
-        <w:t xml:space="preserve">{*auto </w:t>
-      </w:r>
-      <w:proofErr w:type="spellStart"/>
-      <w:r>
-        <w:rPr>
-          <w:sz w:val="24"/>
-          <w:szCs w:val="22"/>
-        </w:rPr>
-        <w:t>autoLink</w:t>
-      </w:r>
-      <w:proofErr w:type="spellEnd"/>
-      <w:r>
-        <w:rPr>
-          <w:sz w:val="24"/>
-          <w:szCs w:val="22"/>
-        </w:rPr>
-        <w:t>}</w:t>
-      </w:r>
-    </w:p>
-    <w:p>
-      <w:pPr>
-        <w:rPr>
-          <w:sz w:val="24"/>
-          <w:szCs w:val="22"/>
-        </w:rPr>
-      </w:pPr>
-    </w:p>
-    <w:p>
-      <w:pPr>
-        <w:rPr>
-          <w:sz w:val="24"/>
-          <w:szCs w:val="22"/>
-        </w:rPr>
-      </w:pPr>
-      <w:proofErr w:type="spellStart"/>
+        <w:t>{*auto autoLink}</w:t>
+      </w:r>
+    </w:p>
+    <w:p>
+      <w:pPr>
+        <w:rPr>
+          <w:sz w:val="24"/>
+          <w:szCs w:val="22"/>
+        </w:rPr>
+      </w:pPr>
+    </w:p>
+    <w:p>
+      <w:pPr>
+        <w:rPr>
+          <w:sz w:val="24"/>
+          <w:szCs w:val="22"/>
+        </w:rPr>
+      </w:pPr>
       <w:r>
         <w:rPr>
           <w:sz w:val="24"/>
@@ -229,37 +158,20 @@
         </w:rPr>
         <w:t>HyperLink</w:t>
       </w:r>
-      <w:proofErr w:type="spellEnd"/>
-    </w:p>
-    <w:p>
-      <w:pPr>
-        <w:rPr>
-          <w:sz w:val="24"/>
-          <w:szCs w:val="22"/>
-        </w:rPr>
-      </w:pPr>
-      <w:r>
-        <w:rPr>
-          <w:sz w:val="24"/>
-          <w:szCs w:val="22"/>
-        </w:rPr>
-        <w:t>{*</w:t>
-      </w:r>
-      <w:proofErr w:type="spellStart"/>
-      <w:r>
-        <w:rPr>
-          <w:sz w:val="24"/>
-          <w:szCs w:val="22"/>
-        </w:rPr>
-        <w:t>COP_link</w:t>
-      </w:r>
-      <w:proofErr w:type="spellEnd"/>
-      <w:r>
-        <w:rPr>
-          <w:sz w:val="24"/>
-          <w:szCs w:val="22"/>
-        </w:rPr>
-        <w:t>}</w:t>
+    </w:p>
+    <w:p>
+      <w:pPr>
+        <w:rPr>
+          <w:sz w:val="24"/>
+          <w:szCs w:val="22"/>
+        </w:rPr>
+      </w:pPr>
+      <w:r>
+        <w:rPr>
+          <w:sz w:val="24"/>
+          <w:szCs w:val="22"/>
+        </w:rPr>
+        <w:t>{*COP_link}</w:t>
       </w:r>
     </w:p>
     <w:p>
@@ -297,23 +209,7 @@
           <w:sz w:val="24"/>
           <w:szCs w:val="22"/>
         </w:rPr>
-        <w:t xml:space="preserve">{style </w:t>
-      </w:r>
-      <w:proofErr w:type="spellStart"/>
-      <w:r>
-        <w:rPr>
-          <w:sz w:val="24"/>
-          <w:szCs w:val="22"/>
-        </w:rPr>
-        <w:t>styled_property</w:t>
-      </w:r>
-      <w:proofErr w:type="spellEnd"/>
-      <w:r>
-        <w:rPr>
-          <w:sz w:val="24"/>
-          <w:szCs w:val="22"/>
-        </w:rPr>
-        <w:t>}</w:t>
+        <w:t>{style styled_property}</w:t>
       </w:r>
     </w:p>
     <w:p>
@@ -338,13 +234,8 @@
       </w:r>
     </w:p>
     <w:p>
-      <w:proofErr w:type="gramStart"/>
-      <w:r>
-        <w:t>{?insert</w:t>
-      </w:r>
-      <w:proofErr w:type="gramEnd"/>
-      <w:r>
-        <w:t xml:space="preserve"> doc}</w:t>
+      <w:r>
+        <w:t>{?insert doc}</w:t>
       </w:r>
     </w:p>
     <w:p>
@@ -402,7 +293,6 @@
           <w:sz w:val="32"/>
           <w:szCs w:val="32"/>
         </w:rPr>
-        <w:lastRenderedPageBreak/>
         <w:t>Border and Cell Styles</w:t>
       </w:r>
     </w:p>
@@ -424,11 +314,9 @@
             <w:r>
               <w:t>{</w:t>
             </w:r>
-            <w:proofErr w:type="spellStart"/>
             <w:r>
               <w:t>cellStyle</w:t>
             </w:r>
-            <w:proofErr w:type="spellEnd"/>
             <w:r>
               <w:t>$}</w:t>
             </w:r>
@@ -509,23 +397,7 @@
       <w:pStyle w:val="Header"/>
     </w:pPr>
     <w:r>
-      <w:t>{</w:t>
-    </w:r>
-    <w:proofErr w:type="spellStart"/>
-    <w:r>
-      <w:t>watemark</w:t>
-    </w:r>
-    <w:proofErr w:type="spellEnd"/>
-    <w:r>
-      <w:t xml:space="preserve"> </w:t>
-    </w:r>
-    <w:proofErr w:type="spellStart"/>
-    <w:r>
-      <w:t>wm_name</w:t>
-    </w:r>
-    <w:proofErr w:type="spellEnd"/>
-    <w:r>
-      <w:t>}</w:t>
+      <w:t>{watemark wm_name}</w:t>
     </w:r>
   </w:p>
   <w:p>

</xml_diff>